<commit_message>
fix: update docs, PDFs and fix page layout issues
- Fix ASV-11-2026.pdf: add @page{size:A4 portrait;margin:0} — pages were shifted right due to WeasyPrint default margins
- Update ASV-11-Presentation.pdf: 8-page regen with visual fixes (full images, DP1 slide, eco-module page, correct stats)
- Update ASV-11-Технический-паспорт.docx: ICE-10, Labcluster, DP1, updated contacts and timeline
- Add three-containers.png: new logistics image for presentation
- Update presentation-cover-card.svg: corrected stats (2-3×, 3×ISO 40')
- Fix index.html hero: remove double 8% padding, add width:100% to hero-content
- Update presentation.html: WeasyPrint layout fixes

Co-Authored-By: Claude Sonnet 4.6 <noreply@anthropic.com>
</commit_message>
<xml_diff>
--- a/ASV-11-Технический-паспорт.docx
+++ b/ASV-11-Технический-паспорт.docx
@@ -92,7 +92,7 @@
                 <w:sz w:val="19"/>
                 <w:szCs w:val="19"/>
               </w:rPr>
-              <w:t xml:space="preserve">WestSeal  ·  westseal.ru  ·  2026</w:t>
+              <w:t xml:space="preserve">Labcluster  ·  labcluster.ru  ·  2026</w:t>
             </w:r>
           </w:p>
         </w:tc>
@@ -253,7 +253,7 @@
                 <w:sz w:val="40"/>
                 <w:szCs w:val="40"/>
               </w:rPr>
-              <w:t xml:space="preserve">Ice-C</w:t>
+              <w:t xml:space="preserve">ICE-10</w:t>
             </w:r>
           </w:p>
           <w:p>
@@ -303,7 +303,7 @@
                 <w:sz w:val="40"/>
                 <w:szCs w:val="40"/>
               </w:rPr>
-              <w:t xml:space="preserve">ISO 20′</w:t>
+              <w:t xml:space="preserve">ISO 40′</w:t>
             </w:r>
           </w:p>
           <w:p>
@@ -373,7 +373,7 @@
                 <w:sz w:val="20"/>
                 <w:szCs w:val="20"/>
               </w:rPr>
-              <w:t xml:space="preserve">Беспилотное надводное судно с алюминиевым корпусом и двойными азиподами для арктических и морских исследований. Разбирается на 3 части, помещается в ISO-контейнер и снижает стоимость морских миссий в 3–5 раз. Модульная кассетная система позволяет менять тип научного оборудования прямо в море, без захода в порт.</w:t>
+              <w:t xml:space="preserve">Беспилотное надводное судно с алюминиевым корпусом и двойными азиподами для арктических и морских исследований. Разбирается на 3 части, помещается в три ISO 40′ контейнера и снижает стоимость морских миссий в 2–3 раза. Модульная кассетная система позволяет менять тип научного оборудования прямо в море, без захода в порт.</w:t>
             </w:r>
           </w:p>
         </w:tc>
@@ -533,7 +533,7 @@
                 <w:sz w:val="36"/>
                 <w:szCs w:val="36"/>
               </w:rPr>
-              <w:t xml:space="preserve">3–5×</w:t>
+              <w:t xml:space="preserve">2–3×</w:t>
             </w:r>
           </w:p>
           <w:p>
@@ -844,7 +844,7 @@
                 <w:sz w:val="20"/>
                 <w:szCs w:val="20"/>
               </w:rPr>
-              <w:t xml:space="preserve">Туманов Иван Сергеевич, WestSeal</w:t>
+              <w:t xml:space="preserve">Нейра Филипп Георгиевич, Labcluster</w:t>
             </w:r>
           </w:p>
         </w:tc>
@@ -1140,7 +1140,7 @@
                 <w:sz w:val="20"/>
                 <w:szCs w:val="20"/>
               </w:rPr>
-              <w:t xml:space="preserve">Ice-C</w:t>
+              <w:t xml:space="preserve">ICE-10</w:t>
             </w:r>
           </w:p>
         </w:tc>
@@ -1288,7 +1288,7 @@
                 <w:sz w:val="20"/>
                 <w:szCs w:val="20"/>
               </w:rPr>
-              <w:t xml:space="preserve">Разборка на 3 части, транспортировка в ISO 20′ или 40′ контейнере</w:t>
+              <w:t xml:space="preserve">Разборка на 3 части, транспортировка в ISO 40′ или 40′ контейнере</w:t>
             </w:r>
           </w:p>
         </w:tc>
@@ -1762,7 +1762,7 @@
                 <w:sz w:val="20"/>
                 <w:szCs w:val="20"/>
               </w:rPr>
-              <w:t xml:space="preserve">Ice-C (РМРС) — шторм до 4 баллов</w:t>
+              <w:t xml:space="preserve">ICE-10 (РМРС) — шторм до 4 баллов</w:t>
             </w:r>
           </w:p>
         </w:tc>
@@ -3397,40 +3397,7 @@
                 <w:sz w:val="18"/>
                 <w:szCs w:val="18"/>
               </w:rPr>
-              <w:t xml:space="preserve">12 грунтовых трубок</w:t>
-            </w:r>
-            <w:r>
-              <w:rPr>
-                <w:rFonts w:ascii="Arial" w:cs="Arial" w:eastAsia="Arial" w:hAnsi="Arial"/>
-                <w:b/>
-                <w:bCs/>
-                <w:color w:val="1B6FA8"/>
-                <w:sz w:val="18"/>
-                <w:szCs w:val="18"/>
-              </w:rPr>
-              <w:t xml:space="preserve">  ·  Авто-подача</w:t>
-            </w:r>
-            <w:r>
-              <w:rPr>
-                <w:rFonts w:ascii="Arial" w:cs="Arial" w:eastAsia="Arial" w:hAnsi="Arial"/>
-                <w:b/>
-                <w:bCs/>
-                <w:color w:val="1B6FA8"/>
-                <w:sz w:val="18"/>
-                <w:szCs w:val="18"/>
-              </w:rPr>
-              <w:t xml:space="preserve">  ·  Серийный отбор</w:t>
-            </w:r>
-            <w:r>
-              <w:rPr>
-                <w:rFonts w:ascii="Arial" w:cs="Arial" w:eastAsia="Arial" w:hAnsi="Arial"/>
-                <w:b/>
-                <w:bCs/>
-                <w:color w:val="1B6FA8"/>
-                <w:sz w:val="18"/>
-                <w:szCs w:val="18"/>
-              </w:rPr>
-              <w:t xml:space="preserve">  ·  Координатная привязка</w:t>
+              <w:t>12 грунтовых трубок  ·  Авто-подача  ·  Серийный отбор  ·  Координатная привязка</w:t>
             </w:r>
           </w:p>
         </w:tc>
@@ -3547,40 +3514,7 @@
                 <w:sz w:val="18"/>
                 <w:szCs w:val="18"/>
               </w:rPr>
-              <w:t xml:space="preserve">CTD-зонд</w:t>
-            </w:r>
-            <w:r>
-              <w:rPr>
-                <w:rFonts w:ascii="Arial" w:cs="Arial" w:eastAsia="Arial" w:hAnsi="Arial"/>
-                <w:b/>
-                <w:bCs/>
-                <w:color w:val="1B6FA8"/>
-                <w:sz w:val="18"/>
-                <w:szCs w:val="18"/>
-              </w:rPr>
-              <w:t xml:space="preserve">  ·  36 батометров</w:t>
-            </w:r>
-            <w:r>
-              <w:rPr>
-                <w:rFonts w:ascii="Arial" w:cs="Arial" w:eastAsia="Arial" w:hAnsi="Arial"/>
-                <w:b/>
-                <w:bCs/>
-                <w:color w:val="1B6FA8"/>
-                <w:sz w:val="18"/>
-                <w:szCs w:val="18"/>
-              </w:rPr>
-              <w:t xml:space="preserve">  ·  Розетка Нискина</w:t>
-            </w:r>
-            <w:r>
-              <w:rPr>
-                <w:rFonts w:ascii="Arial" w:cs="Arial" w:eastAsia="Arial" w:hAnsi="Arial"/>
-                <w:b/>
-                <w:bCs/>
-                <w:color w:val="1B6FA8"/>
-                <w:sz w:val="18"/>
-                <w:szCs w:val="18"/>
-              </w:rPr>
-              <w:t xml:space="preserve">  ·  T / S / O₂ / мутность</w:t>
+              <w:t>CTD-зонд  ·  36 батометров  ·  Розетка Нискина  ·  T / S / O₂ / мутность</w:t>
             </w:r>
           </w:p>
         </w:tc>
@@ -3697,62 +3631,7 @@
                 <w:sz w:val="18"/>
                 <w:szCs w:val="18"/>
               </w:rPr>
-              <w:t xml:space="preserve">4–6 станций</w:t>
-            </w:r>
-            <w:r>
-              <w:rPr>
-                <w:rFonts w:ascii="Arial" w:cs="Arial" w:eastAsia="Arial" w:hAnsi="Arial"/>
-                <w:b/>
-                <w:bCs/>
-                <w:color w:val="1B6FA8"/>
-                <w:sz w:val="18"/>
-                <w:szCs w:val="18"/>
-              </w:rPr>
-              <w:t xml:space="preserve">  ·  O₂-патрон + таймер</w:t>
-            </w:r>
-            <w:r>
-              <w:rPr>
-                <w:rFonts w:ascii="Arial" w:cs="Arial" w:eastAsia="Arial" w:hAnsi="Arial"/>
-                <w:b/>
-                <w:bCs/>
-                <w:color w:val="1B6FA8"/>
-                <w:sz w:val="18"/>
-                <w:szCs w:val="18"/>
-              </w:rPr>
-              <w:t xml:space="preserve">  ·  Буй — свет + радио</w:t>
-            </w:r>
-            <w:r>
-              <w:rPr>
-                <w:rFonts w:ascii="Arial" w:cs="Arial" w:eastAsia="Arial" w:hAnsi="Arial"/>
-                <w:b/>
-                <w:bCs/>
-                <w:color w:val="1B6FA8"/>
-                <w:sz w:val="18"/>
-                <w:szCs w:val="18"/>
-              </w:rPr>
-              <w:t xml:space="preserve">  ·  Acoustic release</w:t>
-            </w:r>
-            <w:r>
-              <w:rPr>
-                <w:rFonts w:ascii="Arial" w:cs="Arial" w:eastAsia="Arial" w:hAnsi="Arial"/>
-                <w:b/>
-                <w:bCs/>
-                <w:color w:val="1B6FA8"/>
-                <w:sz w:val="18"/>
-                <w:szCs w:val="18"/>
-              </w:rPr>
-              <w:t xml:space="preserve">  ·  LBL-сеть</w:t>
-            </w:r>
-            <w:r>
-              <w:rPr>
-                <w:rFonts w:ascii="Arial" w:cs="Arial" w:eastAsia="Arial" w:hAnsi="Arial"/>
-                <w:b/>
-                <w:bCs/>
-                <w:color w:val="1B6FA8"/>
-                <w:sz w:val="18"/>
-                <w:szCs w:val="18"/>
-              </w:rPr>
-              <w:t xml:space="preserve">  ·  Нулевая потеря</w:t>
+              <w:t>4–6 станций  ·  O₂-патрон + таймер  ·  Буй — свет + радио  ·  Acoustic release  ·  LBL-сеть  ·  Нулевая потеря</w:t>
             </w:r>
           </w:p>
         </w:tc>
@@ -3869,40 +3748,7 @@
                 <w:sz w:val="18"/>
                 <w:szCs w:val="18"/>
               </w:rPr>
-              <w:t xml:space="preserve">ROV до 200 кг</w:t>
-            </w:r>
-            <w:r>
-              <w:rPr>
-                <w:rFonts w:ascii="Arial" w:cs="Arial" w:eastAsia="Arial" w:hAnsi="Arial"/>
-                <w:b/>
-                <w:bCs/>
-                <w:color w:val="1B6FA8"/>
-                <w:sz w:val="18"/>
-                <w:szCs w:val="18"/>
-              </w:rPr>
-              <w:t xml:space="preserve">  ·  Раздвижной пандус</w:t>
-            </w:r>
-            <w:r>
-              <w:rPr>
-                <w:rFonts w:ascii="Arial" w:cs="Arial" w:eastAsia="Arial" w:hAnsi="Arial"/>
-                <w:b/>
-                <w:bCs/>
-                <w:color w:val="1B6FA8"/>
-                <w:sz w:val="18"/>
-                <w:szCs w:val="18"/>
-              </w:rPr>
-              <w:t xml:space="preserve">  ·  Ретранслятор</w:t>
-            </w:r>
-            <w:r>
-              <w:rPr>
-                <w:rFonts w:ascii="Arial" w:cs="Arial" w:eastAsia="Arial" w:hAnsi="Arial"/>
-                <w:b/>
-                <w:bCs/>
-                <w:color w:val="1B6FA8"/>
-                <w:sz w:val="18"/>
-                <w:szCs w:val="18"/>
-              </w:rPr>
-              <w:t xml:space="preserve">  ·  USBL-привязка</w:t>
+              <w:t>ROV до 200 кг  ·  Раздвижной пандус  ·  Ретранслятор  ·  USBL-привязка</w:t>
             </w:r>
           </w:p>
         </w:tc>
@@ -4019,40 +3865,7 @@
                 <w:sz w:val="18"/>
                 <w:szCs w:val="18"/>
               </w:rPr>
-              <w:t xml:space="preserve">ГБО</w:t>
-            </w:r>
-            <w:r>
-              <w:rPr>
-                <w:rFonts w:ascii="Arial" w:cs="Arial" w:eastAsia="Arial" w:hAnsi="Arial"/>
-                <w:b/>
-                <w:bCs/>
-                <w:color w:val="1B6FA8"/>
-                <w:sz w:val="18"/>
-                <w:szCs w:val="18"/>
-              </w:rPr>
-              <w:t xml:space="preserve">  ·  Субдонный профилограф</w:t>
-            </w:r>
-            <w:r>
-              <w:rPr>
-                <w:rFonts w:ascii="Arial" w:cs="Arial" w:eastAsia="Arial" w:hAnsi="Arial"/>
-                <w:b/>
-                <w:bCs/>
-                <w:color w:val="1B6FA8"/>
-                <w:sz w:val="18"/>
-                <w:szCs w:val="18"/>
-              </w:rPr>
-              <w:t xml:space="preserve">  ·  Магнитометр</w:t>
-            </w:r>
-            <w:r>
-              <w:rPr>
-                <w:rFonts w:ascii="Arial" w:cs="Arial" w:eastAsia="Arial" w:hAnsi="Arial"/>
-                <w:b/>
-                <w:bCs/>
-                <w:color w:val="1B6FA8"/>
-                <w:sz w:val="18"/>
-                <w:szCs w:val="18"/>
-              </w:rPr>
-              <w:t xml:space="preserve">  ·  Сейсмическая коса</w:t>
+              <w:t>ГБО  ·  Субдонный профилограф  ·  Магнитометр  ·  Сейсмическая коса</w:t>
             </w:r>
           </w:p>
         </w:tc>
@@ -5321,7 +5134,7 @@
                 <w:sz w:val="20"/>
                 <w:szCs w:val="20"/>
               </w:rPr>
-              <w:t xml:space="preserve">2–3 мес.</w:t>
+              <w:t xml:space="preserve">3–4 мес.</w:t>
             </w:r>
           </w:p>
         </w:tc>
@@ -5465,7 +5278,7 @@
                 <w:sz w:val="20"/>
                 <w:szCs w:val="20"/>
               </w:rPr>
-              <w:t xml:space="preserve">3–5 мес.</w:t>
+              <w:t xml:space="preserve">4–6 мес.</w:t>
             </w:r>
           </w:p>
         </w:tc>
@@ -5609,7 +5422,7 @@
                 <w:sz w:val="20"/>
                 <w:szCs w:val="20"/>
               </w:rPr>
-              <w:t xml:space="preserve">1–2 мес.</w:t>
+              <w:t xml:space="preserve">2–3 мес.</w:t>
             </w:r>
           </w:p>
         </w:tc>
@@ -5644,150 +5457,6 @@
                 <w:szCs w:val="20"/>
               </w:rPr>
               <w:t xml:space="preserve">Ходовые тесты, автономный режим, контейнерная погрузка</w:t>
-            </w:r>
-          </w:p>
-        </w:tc>
-      </w:tr>
-      <w:tr>
-        <w:tc>
-          <w:tcPr>
-            <w:tcW w:type="dxa" w:w="700"/>
-            <w:tcBorders>
-              <w:top w:val="single" w:color="DDE3EA" w:sz="4"/>
-              <w:left w:val="single" w:color="DDE3EA" w:sz="4"/>
-              <w:bottom w:val="single" w:color="DDE3EA" w:sz="4"/>
-              <w:right w:val="single" w:color="DDE3EA" w:sz="4"/>
-            </w:tcBorders>
-            <w:shd w:fill="FFFFFF" w:val="clear"/>
-            <w:tcMar>
-              <w:top w:type="dxa" w:w="100"/>
-              <w:left w:type="dxa" w:w="140"/>
-              <w:bottom w:type="dxa" w:w="100"/>
-              <w:right w:type="dxa" w:w="140"/>
-            </w:tcMar>
-            <w:vAlign w:val="center"/>
-          </w:tcPr>
-          <w:p>
-            <w:pPr>
-              <w:spacing w:before="0" w:after="0"/>
-              <w:jc w:val="center"/>
-            </w:pPr>
-            <w:r>
-              <w:rPr>
-                <w:rFonts w:ascii="Arial" w:cs="Arial" w:eastAsia="Arial" w:hAnsi="Arial"/>
-                <w:b/>
-                <w:bCs/>
-                <w:color w:val="E05206"/>
-                <w:sz w:val="22"/>
-                <w:szCs w:val="22"/>
-              </w:rPr>
-              <w:t xml:space="preserve">4</w:t>
-            </w:r>
-          </w:p>
-        </w:tc>
-        <w:tc>
-          <w:tcPr>
-            <w:tcW w:type="dxa" w:w="2600"/>
-            <w:tcBorders>
-              <w:top w:val="single" w:color="DDE3EA" w:sz="4"/>
-              <w:left w:val="single" w:color="DDE3EA" w:sz="4"/>
-              <w:bottom w:val="single" w:color="DDE3EA" w:sz="4"/>
-              <w:right w:val="single" w:color="DDE3EA" w:sz="4"/>
-            </w:tcBorders>
-            <w:shd w:fill="FFFFFF" w:val="clear"/>
-            <w:tcMar>
-              <w:top w:type="dxa" w:w="100"/>
-              <w:left w:type="dxa" w:w="140"/>
-              <w:bottom w:type="dxa" w:w="100"/>
-              <w:right w:type="dxa" w:w="140"/>
-            </w:tcMar>
-            <w:vAlign w:val="center"/>
-          </w:tcPr>
-          <w:p>
-            <w:pPr>
-              <w:spacing w:before="0" w:after="0"/>
-              <w:jc w:val="left"/>
-            </w:pPr>
-            <w:r>
-              <w:rPr>
-                <w:rFonts w:ascii="Arial" w:cs="Arial" w:eastAsia="Arial" w:hAnsi="Arial"/>
-                <w:b/>
-                <w:bCs/>
-                <w:color w:val="1A1A1A"/>
-                <w:sz w:val="20"/>
-                <w:szCs w:val="20"/>
-              </w:rPr>
-              <w:t xml:space="preserve">Серийное производство</w:t>
-            </w:r>
-          </w:p>
-        </w:tc>
-        <w:tc>
-          <w:tcPr>
-            <w:tcW w:type="dxa" w:w="1600"/>
-            <w:tcBorders>
-              <w:top w:val="single" w:color="DDE3EA" w:sz="4"/>
-              <w:left w:val="single" w:color="DDE3EA" w:sz="4"/>
-              <w:bottom w:val="single" w:color="DDE3EA" w:sz="4"/>
-              <w:right w:val="single" w:color="DDE3EA" w:sz="4"/>
-            </w:tcBorders>
-            <w:shd w:fill="FFFFFF" w:val="clear"/>
-            <w:tcMar>
-              <w:top w:type="dxa" w:w="100"/>
-              <w:left w:type="dxa" w:w="140"/>
-              <w:bottom w:type="dxa" w:w="100"/>
-              <w:right w:type="dxa" w:w="140"/>
-            </w:tcMar>
-            <w:vAlign w:val="center"/>
-          </w:tcPr>
-          <w:p>
-            <w:pPr>
-              <w:spacing w:before="0" w:after="0"/>
-              <w:jc w:val="left"/>
-            </w:pPr>
-            <w:r>
-              <w:rPr>
-                <w:rFonts w:ascii="Arial" w:cs="Arial" w:eastAsia="Arial" w:hAnsi="Arial"/>
-                <w:b/>
-                <w:bCs/>
-                <w:color w:val="E05206"/>
-                <w:sz w:val="20"/>
-                <w:szCs w:val="20"/>
-              </w:rPr>
-              <w:t xml:space="preserve">6+ мес.</w:t>
-            </w:r>
-          </w:p>
-        </w:tc>
-        <w:tc>
-          <w:tcPr>
-            <w:tcW w:type="dxa" w:w="4738"/>
-            <w:tcBorders>
-              <w:top w:val="single" w:color="DDE3EA" w:sz="4"/>
-              <w:left w:val="single" w:color="DDE3EA" w:sz="4"/>
-              <w:bottom w:val="single" w:color="DDE3EA" w:sz="4"/>
-              <w:right w:val="single" w:color="DDE3EA" w:sz="4"/>
-            </w:tcBorders>
-            <w:shd w:fill="FFFFFF" w:val="clear"/>
-            <w:tcMar>
-              <w:top w:type="dxa" w:w="100"/>
-              <w:left w:type="dxa" w:w="140"/>
-              <w:bottom w:type="dxa" w:w="100"/>
-              <w:right w:type="dxa" w:w="140"/>
-            </w:tcMar>
-            <w:vAlign w:val="center"/>
-          </w:tcPr>
-          <w:p>
-            <w:pPr>
-              <w:spacing w:before="0" w:after="0"/>
-              <w:jc w:val="left"/>
-            </w:pPr>
-            <w:r>
-              <w:rPr>
-                <w:rFonts w:ascii="Arial" w:cs="Arial" w:eastAsia="Arial" w:hAnsi="Arial"/>
-                <w:color w:val="5A6370"/>
-                <w:sz w:val="20"/>
-                <w:szCs w:val="20"/>
-              </w:rPr>
-              <w:t xml:space="preserve">Выход на серию, сервис, развитие партнёрской сети</w:t>
             </w:r>
           </w:p>
         </w:tc>
@@ -5822,7 +5491,7 @@
                 <w:sz w:val="20"/>
                 <w:szCs w:val="20"/>
               </w:rPr>
-              <w:t xml:space="preserve">Итого до коммерческого запуска:  </w:t>
+              <w:t xml:space="preserve">Итого до ходовых тестов:  </w:t>
             </w:r>
             <w:r>
               <w:rPr>
@@ -5833,7 +5502,7 @@
                 <w:sz w:val="24"/>
                 <w:szCs w:val="24"/>
               </w:rPr>
-              <w:t xml:space="preserve">≈ 9–12 месяцев</w:t>
+              <w:t xml:space="preserve">10–12 месяцев</w:t>
             </w:r>
           </w:p>
         </w:tc>
@@ -5944,7 +5613,7 @@
                 <w:sz w:val="28"/>
                 <w:szCs w:val="28"/>
               </w:rPr>
-              <w:t xml:space="preserve">WestSeal</w:t>
+              <w:t xml:space="preserve">Labcluster</w:t>
             </w:r>
           </w:p>
           <w:p>
@@ -5961,7 +5630,7 @@
                 <w:sz w:val="20"/>
                 <w:szCs w:val="20"/>
               </w:rPr>
-              <w:t xml:space="preserve">Туманов Иван Сергеевич</w:t>
+              <w:t xml:space="preserve">Нейра Филипп Георгиевич</w:t>
             </w:r>
           </w:p>
           <w:p>
@@ -6001,7 +5670,7 @@
                 <w:sz w:val="20"/>
                 <w:szCs w:val="20"/>
               </w:rPr>
-              <w:t xml:space="preserve">westseal@mail.ru</w:t>
+              <w:t xml:space="preserve">neira@labcluster.ru</w:t>
             </w:r>
           </w:p>
           <w:p>
@@ -6025,7 +5694,7 @@
                 <w:sz w:val="20"/>
                 <w:szCs w:val="20"/>
               </w:rPr>
-              <w:t xml:space="preserve">+7 962 684-96-11</w:t>
+              <w:t xml:space="preserve">+7 911 299-95-86</w:t>
             </w:r>
           </w:p>
           <w:p>
@@ -6050,7 +5719,7 @@
                 <w:sz w:val="20"/>
                 <w:szCs w:val="20"/>
               </w:rPr>
-              <w:t xml:space="preserve">westseal.ru</w:t>
+              <w:t xml:space="preserve">labcluster.ru</w:t>
             </w:r>
           </w:p>
         </w:tc>

</xml_diff>